<commit_message>
Update CLI integrations and document templates
</commit_message>
<xml_diff>
--- a/assets/report-templates/word/reference.docx
+++ b/assets/report-templates/word/reference.docx
@@ -427,7 +427,7 @@
     <w:rsid w:val="00FC693F"/>
     <w:pPr>
       <w:widowControl/>
-      <w:spacing w:line="336" w:lineRule="auto" w:after="160"/>
+      <w:spacing w:line="336" w:lineRule="auto" w:before="0" w:after="0"/>
     </w:pPr>
     <w:rPr>
       <w:rFonts w:ascii="Aptos" w:hAnsi="Aptos" w:eastAsia="PingFang SC"/>
@@ -866,7 +866,7 @@
     <w:qFormat/>
     <w:rsid w:val="00FC693F"/>
     <w:pPr>
-      <w:spacing w:line="336" w:lineRule="auto" w:after="80"/>
+      <w:spacing w:line="336" w:lineRule="auto" w:before="0" w:after="0"/>
       <w:ind w:left="420" w:hanging="210"/>
       <w:contextualSpacing/>
     </w:pPr>
@@ -886,7 +886,7 @@
     <w:rsid w:val="00AA1D8D"/>
     <w:pPr>
       <w:widowControl/>
-      <w:spacing w:after="160" w:line="336" w:lineRule="auto"/>
+      <w:spacing w:after="0" w:line="336" w:lineRule="auto" w:before="0"/>
     </w:pPr>
     <w:rPr>
       <w:rFonts w:ascii="Aptos" w:hAnsi="Aptos" w:eastAsia="PingFang SC"/>
@@ -1137,7 +1137,7 @@
     <w:qFormat/>
     <w:rsid w:val="00FC693F"/>
     <w:pPr>
-      <w:spacing w:before="120" w:after="120"/>
+      <w:spacing w:before="0" w:after="0"/>
       <w:ind w:left="454" w:right="454"/>
     </w:pPr>
     <w:rPr>
@@ -1258,7 +1258,7 @@
     <w:rsid w:val="00FC693F"/>
     <w:pPr>
       <w:keepNext/>
-      <w:spacing w:line="240" w:lineRule="auto" w:before="80" w:after="160"/>
+      <w:spacing w:line="240" w:lineRule="auto" w:before="0" w:after="0"/>
       <w:jc w:val="left"/>
     </w:pPr>
     <w:rPr>
@@ -12195,7 +12195,7 @@
     <w:basedOn w:val="Normal"/>
     <w:pPr>
       <w:widowControl/>
-      <w:spacing w:line="336" w:lineRule="auto" w:after="160"/>
+      <w:spacing w:line="336" w:lineRule="auto" w:before="0" w:after="0"/>
       <w:ind w:firstLine="0"/>
     </w:pPr>
     <w:rPr>
@@ -12209,7 +12209,7 @@
     <w:name w:val="Source Code"/>
     <w:basedOn w:val="Normal"/>
     <w:pPr>
-      <w:spacing w:line="276" w:lineRule="auto" w:before="120" w:after="160"/>
+      <w:spacing w:line="276" w:lineRule="auto" w:before="0" w:after="0"/>
       <w:ind w:left="283" w:right="283"/>
     </w:pPr>
     <w:rPr>
@@ -12273,42 +12273,42 @@
     <w:name w:val="TOC 1"/>
     <w:basedOn w:val="Normal"/>
     <w:pPr>
-      <w:spacing w:before="100" w:after="60"/>
+      <w:spacing w:before="20" w:after="20"/>
       <w:ind w:left="0"/>
     </w:pPr>
     <w:rPr>
       <w:rFonts w:ascii="Aptos" w:hAnsi="Aptos" w:eastAsia="PingFang SC"/>
       <w:b/>
       <w:color w:val="243447"/>
-      <w:sz w:val="21"/>
+      <w:sz w:val="26"/>
     </w:rPr>
   </w:style>
   <w:style w:type="paragraph" w:customStyle="1" w:styleId="TOC2">
     <w:name w:val="TOC 2"/>
     <w:basedOn w:val="Normal"/>
     <w:pPr>
-      <w:spacing w:before="40" w:after="60"/>
+      <w:spacing w:before="0" w:after="20"/>
       <w:ind w:left="312"/>
     </w:pPr>
     <w:rPr>
       <w:rFonts w:ascii="Aptos" w:hAnsi="Aptos" w:eastAsia="PingFang SC"/>
       <w:b w:val="0"/>
       <w:color w:val="243447"/>
-      <w:sz w:val="19"/>
+      <w:sz w:val="24"/>
     </w:rPr>
   </w:style>
   <w:style w:type="paragraph" w:customStyle="1" w:styleId="TOC3">
     <w:name w:val="TOC 3"/>
     <w:basedOn w:val="Normal"/>
     <w:pPr>
-      <w:spacing w:before="40" w:after="60"/>
+      <w:spacing w:before="0" w:after="20"/>
       <w:ind w:left="624"/>
     </w:pPr>
     <w:rPr>
       <w:rFonts w:ascii="Aptos" w:hAnsi="Aptos" w:eastAsia="PingFang SC"/>
       <w:b w:val="0"/>
       <w:color w:val="243447"/>
-      <w:sz w:val="18"/>
+      <w:sz w:val="22"/>
     </w:rPr>
   </w:style>
   <w:style w:type="table" w:customStyle="1" w:styleId="Table">

</xml_diff>